<commit_message>
Add quarterly target attainment section to raise case
Co-Authored-By: Claude Sonnet 5.5 <noreply@anthropic.com>
Claude-Session: https://claude.ai/code/session_01MGaeBftyY4mHww6FcGxse3
</commit_message>
<xml_diff>
--- a/Raise_Case_Bailey_Harris.docx
+++ b/Raise_Case_Bailey_Harris.docx
@@ -1197,6 +1197,544 @@
           <w:rFonts w:ascii="Calibri" w:hAnsi="Calibri"/>
           <w:color w:val="1B3F66"/>
         </w:rPr>
+        <w:t>2b. I have beaten every target set for me</w:t>
+      </w:r>
+    </w:p>
+    <w:p>
+      <w:pPr>
+        <w:spacing w:after="80"/>
+      </w:pPr>
+      <w:r>
+        <w:rPr>
+          <w:b w:val="0"/>
+          <w:i w:val="0"/>
+        </w:rPr>
+        <w:t>Since the structure change, my manager (Mike Caldwell) has set my quarterly targets in writing. I have exceeded each one:</w:t>
+      </w:r>
+    </w:p>
+    <w:tbl>
+      <w:tblPr>
+        <w:tblStyle w:val="TableGrid"/>
+        <w:tblW w:type="auto" w:w="0"/>
+        <w:tblLook w:firstColumn="1" w:firstRow="1" w:lastColumn="0" w:lastRow="0" w:noHBand="0" w:noVBand="1" w:val="04A0"/>
+      </w:tblPr>
+      <w:tblGrid>
+        <w:gridCol w:w="1930"/>
+        <w:gridCol w:w="1930"/>
+        <w:gridCol w:w="1930"/>
+        <w:gridCol w:w="1930"/>
+        <w:gridCol w:w="1930"/>
+      </w:tblGrid>
+      <w:tr>
+        <w:tc>
+          <w:tcPr>
+            <w:tcW w:type="dxa" w:w="1930"/>
+            <w:shd w:val="clear" w:fill="1B3F66"/>
+          </w:tcPr>
+          <w:p>
+            <w:r/>
+            <w:r>
+              <w:rPr>
+                <w:b/>
+                <w:color w:val="FFFFFF"/>
+                <w:sz w:val="19"/>
+              </w:rPr>
+              <w:t>Quarter</w:t>
+            </w:r>
+          </w:p>
+        </w:tc>
+        <w:tc>
+          <w:tcPr>
+            <w:tcW w:type="dxa" w:w="1930"/>
+            <w:shd w:val="clear" w:fill="1B3F66"/>
+          </w:tcPr>
+          <w:p>
+            <w:pPr>
+              <w:jc w:val="right"/>
+            </w:pPr>
+            <w:r/>
+            <w:r>
+              <w:rPr>
+                <w:b/>
+                <w:color w:val="FFFFFF"/>
+                <w:sz w:val="19"/>
+              </w:rPr>
+              <w:t>Target set by Mike</w:t>
+            </w:r>
+          </w:p>
+        </w:tc>
+        <w:tc>
+          <w:tcPr>
+            <w:tcW w:type="dxa" w:w="1930"/>
+            <w:shd w:val="clear" w:fill="1B3F66"/>
+          </w:tcPr>
+          <w:p>
+            <w:pPr>
+              <w:jc w:val="right"/>
+            </w:pPr>
+            <w:r/>
+            <w:r>
+              <w:rPr>
+                <w:b/>
+                <w:color w:val="FFFFFF"/>
+                <w:sz w:val="19"/>
+              </w:rPr>
+              <w:t>Actual closed</w:t>
+            </w:r>
+          </w:p>
+        </w:tc>
+        <w:tc>
+          <w:tcPr>
+            <w:tcW w:type="dxa" w:w="1930"/>
+            <w:shd w:val="clear" w:fill="1B3F66"/>
+          </w:tcPr>
+          <w:p>
+            <w:pPr>
+              <w:jc w:val="right"/>
+            </w:pPr>
+            <w:r/>
+            <w:r>
+              <w:rPr>
+                <w:b/>
+                <w:color w:val="FFFFFF"/>
+                <w:sz w:val="19"/>
+              </w:rPr>
+              <w:t>% of target</w:t>
+            </w:r>
+          </w:p>
+        </w:tc>
+        <w:tc>
+          <w:tcPr>
+            <w:tcW w:type="dxa" w:w="1930"/>
+            <w:shd w:val="clear" w:fill="1B3F66"/>
+          </w:tcPr>
+          <w:p>
+            <w:pPr>
+              <w:jc w:val="right"/>
+            </w:pPr>
+            <w:r/>
+            <w:r>
+              <w:rPr>
+                <w:b/>
+                <w:color w:val="FFFFFF"/>
+                <w:sz w:val="19"/>
+              </w:rPr>
+              <w:t>Basis Mike gave</w:t>
+            </w:r>
+          </w:p>
+        </w:tc>
+      </w:tr>
+      <w:tr>
+        <w:tc>
+          <w:tcPr>
+            <w:tcW w:type="dxa" w:w="1930"/>
+          </w:tcPr>
+          <w:p>
+            <w:r/>
+            <w:r>
+              <w:rPr>
+                <w:sz w:val="19"/>
+              </w:rPr>
+              <w:t>Q4 2025</w:t>
+            </w:r>
+          </w:p>
+        </w:tc>
+        <w:tc>
+          <w:tcPr>
+            <w:tcW w:type="dxa" w:w="1930"/>
+          </w:tcPr>
+          <w:p>
+            <w:pPr>
+              <w:jc w:val="right"/>
+            </w:pPr>
+            <w:r/>
+            <w:r>
+              <w:rPr>
+                <w:sz w:val="19"/>
+              </w:rPr>
+              <w:t>$74,000</w:t>
+            </w:r>
+          </w:p>
+        </w:tc>
+        <w:tc>
+          <w:tcPr>
+            <w:tcW w:type="dxa" w:w="1930"/>
+          </w:tcPr>
+          <w:p>
+            <w:pPr>
+              <w:jc w:val="right"/>
+            </w:pPr>
+            <w:r/>
+            <w:r>
+              <w:rPr>
+                <w:sz w:val="19"/>
+              </w:rPr>
+              <w:t>$86,023</w:t>
+            </w:r>
+          </w:p>
+        </w:tc>
+        <w:tc>
+          <w:tcPr>
+            <w:tcW w:type="dxa" w:w="1930"/>
+          </w:tcPr>
+          <w:p>
+            <w:pPr>
+              <w:jc w:val="right"/>
+            </w:pPr>
+            <w:r/>
+            <w:r>
+              <w:rPr>
+                <w:sz w:val="19"/>
+              </w:rPr>
+              <w:t>116%</w:t>
+            </w:r>
+          </w:p>
+        </w:tc>
+        <w:tc>
+          <w:tcPr>
+            <w:tcW w:type="dxa" w:w="1930"/>
+          </w:tcPr>
+          <w:p>
+            <w:pPr>
+              <w:jc w:val="right"/>
+            </w:pPr>
+            <w:r/>
+            <w:r>
+              <w:rPr>
+                <w:sz w:val="19"/>
+              </w:rPr>
+              <w:t>Q4 2024 ($62,026) + 20%</w:t>
+            </w:r>
+          </w:p>
+        </w:tc>
+      </w:tr>
+      <w:tr>
+        <w:tc>
+          <w:tcPr>
+            <w:tcW w:type="dxa" w:w="1930"/>
+          </w:tcPr>
+          <w:p>
+            <w:r/>
+            <w:r>
+              <w:rPr>
+                <w:sz w:val="19"/>
+              </w:rPr>
+              <w:t>Q1 2026</w:t>
+            </w:r>
+          </w:p>
+        </w:tc>
+        <w:tc>
+          <w:tcPr>
+            <w:tcW w:type="dxa" w:w="1930"/>
+          </w:tcPr>
+          <w:p>
+            <w:pPr>
+              <w:jc w:val="right"/>
+            </w:pPr>
+            <w:r/>
+            <w:r>
+              <w:rPr>
+                <w:sz w:val="19"/>
+              </w:rPr>
+              <w:t>$53,000</w:t>
+            </w:r>
+          </w:p>
+        </w:tc>
+        <w:tc>
+          <w:tcPr>
+            <w:tcW w:type="dxa" w:w="1930"/>
+          </w:tcPr>
+          <w:p>
+            <w:pPr>
+              <w:jc w:val="right"/>
+            </w:pPr>
+            <w:r/>
+            <w:r>
+              <w:rPr>
+                <w:sz w:val="19"/>
+              </w:rPr>
+              <w:t>$82,672</w:t>
+            </w:r>
+          </w:p>
+        </w:tc>
+        <w:tc>
+          <w:tcPr>
+            <w:tcW w:type="dxa" w:w="1930"/>
+          </w:tcPr>
+          <w:p>
+            <w:pPr>
+              <w:jc w:val="right"/>
+            </w:pPr>
+            <w:r/>
+            <w:r>
+              <w:rPr>
+                <w:sz w:val="19"/>
+              </w:rPr>
+              <w:t>156%</w:t>
+            </w:r>
+          </w:p>
+        </w:tc>
+        <w:tc>
+          <w:tcPr>
+            <w:tcW w:type="dxa" w:w="1930"/>
+          </w:tcPr>
+          <w:p>
+            <w:pPr>
+              <w:jc w:val="right"/>
+            </w:pPr>
+            <w:r/>
+            <w:r>
+              <w:rPr>
+                <w:sz w:val="19"/>
+              </w:rPr>
+              <w:t>10% growth target</w:t>
+            </w:r>
+          </w:p>
+        </w:tc>
+      </w:tr>
+      <w:tr>
+        <w:tc>
+          <w:tcPr>
+            <w:tcW w:type="dxa" w:w="1930"/>
+          </w:tcPr>
+          <w:p>
+            <w:r/>
+            <w:r>
+              <w:rPr>
+                <w:sz w:val="19"/>
+              </w:rPr>
+              <w:t>Q2 2026</w:t>
+            </w:r>
+          </w:p>
+        </w:tc>
+        <w:tc>
+          <w:tcPr>
+            <w:tcW w:type="dxa" w:w="1930"/>
+          </w:tcPr>
+          <w:p>
+            <w:pPr>
+              <w:jc w:val="right"/>
+            </w:pPr>
+            <w:r/>
+            <w:r>
+              <w:rPr>
+                <w:sz w:val="19"/>
+              </w:rPr>
+              <w:t>$150,000</w:t>
+            </w:r>
+          </w:p>
+        </w:tc>
+        <w:tc>
+          <w:tcPr>
+            <w:tcW w:type="dxa" w:w="1930"/>
+          </w:tcPr>
+          <w:p>
+            <w:pPr>
+              <w:jc w:val="right"/>
+            </w:pPr>
+            <w:r/>
+            <w:r>
+              <w:rPr>
+                <w:sz w:val="19"/>
+              </w:rPr>
+              <w:t>$207,806</w:t>
+            </w:r>
+          </w:p>
+        </w:tc>
+        <w:tc>
+          <w:tcPr>
+            <w:tcW w:type="dxa" w:w="1930"/>
+          </w:tcPr>
+          <w:p>
+            <w:pPr>
+              <w:jc w:val="right"/>
+            </w:pPr>
+            <w:r/>
+            <w:r>
+              <w:rPr>
+                <w:sz w:val="19"/>
+              </w:rPr>
+              <w:t>139%</w:t>
+            </w:r>
+          </w:p>
+        </w:tc>
+        <w:tc>
+          <w:tcPr>
+            <w:tcW w:type="dxa" w:w="1930"/>
+          </w:tcPr>
+          <w:p>
+            <w:pPr>
+              <w:jc w:val="right"/>
+            </w:pPr>
+            <w:r/>
+            <w:r>
+              <w:rPr>
+                <w:sz w:val="19"/>
+              </w:rPr>
+              <w:t>Q2 2025 ($129K) + accounts transferred from Xiaonan ($37K)</w:t>
+            </w:r>
+          </w:p>
+        </w:tc>
+      </w:tr>
+      <w:tr>
+        <w:tc>
+          <w:tcPr>
+            <w:tcW w:type="dxa" w:w="1930"/>
+          </w:tcPr>
+          <w:p>
+            <w:r/>
+            <w:r>
+              <w:rPr>
+                <w:sz w:val="19"/>
+              </w:rPr>
+              <w:t>Q3 2026</w:t>
+            </w:r>
+          </w:p>
+        </w:tc>
+        <w:tc>
+          <w:tcPr>
+            <w:tcW w:type="dxa" w:w="1930"/>
+          </w:tcPr>
+          <w:p>
+            <w:pPr>
+              <w:jc w:val="right"/>
+            </w:pPr>
+            <w:r/>
+            <w:r>
+              <w:rPr>
+                <w:sz w:val="19"/>
+              </w:rPr>
+              <w:t>$155,000</w:t>
+            </w:r>
+          </w:p>
+        </w:tc>
+        <w:tc>
+          <w:tcPr>
+            <w:tcW w:type="dxa" w:w="1930"/>
+          </w:tcPr>
+          <w:p>
+            <w:pPr>
+              <w:jc w:val="right"/>
+            </w:pPr>
+            <w:r/>
+            <w:r>
+              <w:rPr>
+                <w:sz w:val="19"/>
+              </w:rPr>
+              <w:t>$172,687</w:t>
+            </w:r>
+          </w:p>
+        </w:tc>
+        <w:tc>
+          <w:tcPr>
+            <w:tcW w:type="dxa" w:w="1930"/>
+          </w:tcPr>
+          <w:p>
+            <w:pPr>
+              <w:jc w:val="right"/>
+            </w:pPr>
+            <w:r/>
+            <w:r>
+              <w:rPr>
+                <w:sz w:val="19"/>
+              </w:rPr>
+              <w:t>111%</w:t>
+            </w:r>
+          </w:p>
+        </w:tc>
+        <w:tc>
+          <w:tcPr>
+            <w:tcW w:type="dxa" w:w="1930"/>
+          </w:tcPr>
+          <w:p>
+            <w:pPr>
+              <w:jc w:val="right"/>
+            </w:pPr>
+            <w:r/>
+            <w:r>
+              <w:rPr>
+                <w:sz w:val="19"/>
+              </w:rPr>
+              <w:t>Q3 2025 + 5% growth target</w:t>
+            </w:r>
+          </w:p>
+        </w:tc>
+      </w:tr>
+    </w:tbl>
+    <w:p>
+      <w:pPr>
+        <w:spacing w:after="40"/>
+      </w:pPr>
+    </w:p>
+    <w:p>
+      <w:pPr>
+        <w:pStyle w:val="ListBullet"/>
+        <w:spacing w:after="40"/>
+      </w:pPr>
+      <w:r>
+        <w:rPr>
+          <w:b/>
+        </w:rPr>
+        <w:t>Consistent over-performance.</w:t>
+      </w:r>
+      <w:r>
+        <w:t xml:space="preserve"> Four of four quarters at 111%–156% of target, with no misses. Combined, I closed $549K against $432K of targets (127%).</w:t>
+      </w:r>
+    </w:p>
+    <w:p>
+      <w:pPr>
+        <w:pStyle w:val="ListBullet"/>
+        <w:spacing w:after="40"/>
+      </w:pPr>
+      <w:r>
+        <w:rPr>
+          <w:b/>
+        </w:rPr>
+        <w:t>Absorbed transferred accounts and still exceeded.</w:t>
+      </w:r>
+      <w:r>
+        <w:t xml:space="preserve"> The Q2 target already included the $37K of accounts transferred from Xiaonan, and I beat it by $58K. Q4 2026 is under way ($31K closed in October) and I will be above the formula again if the pattern holds.</w:t>
+      </w:r>
+    </w:p>
+    <w:p>
+      <w:pPr>
+        <w:pStyle w:val="ListBullet"/>
+        <w:spacing w:after="40"/>
+      </w:pPr>
+      <w:r>
+        <w:rPr>
+          <w:b/>
+        </w:rPr>
+        <w:t>Management's own yardstick.</w:t>
+      </w:r>
+      <w:r>
+        <w:t xml:space="preserve"> These are targets my manager set and confirmed by email, so they are an objective measure of expected performance. My base has stayed at $60,000 throughout.</w:t>
+      </w:r>
+    </w:p>
+    <w:p>
+      <w:pPr>
+        <w:pStyle w:val="ListBullet"/>
+        <w:spacing w:after="40"/>
+      </w:pPr>
+      <w:r>
+        <w:rPr>
+          <w:b/>
+        </w:rPr>
+        <w:t>Ratchet effect.</w:t>
+      </w:r>
+      <w:r>
+        <w:t xml:space="preserve"> Each target was based on the prior year's result plus growth, so exceeding it also means my baseline for next year keeps rising.</w:t>
+      </w:r>
+    </w:p>
+    <w:p>
+      <w:pPr>
+        <w:pStyle w:val="Heading1"/>
+      </w:pPr>
+      <w:r>
+        <w:rPr>
+          <w:rFonts w:ascii="Calibri" w:hAnsi="Calibri"/>
+          <w:color w:val="1B3F66"/>
+        </w:rPr>
         <w:t>3. The June 2026 price increase I planned</w:t>
       </w:r>
     </w:p>

</xml_diff>

<commit_message>
Add raise breakdown vs merit and promotion benchmarks
Co-Authored-By: Claude Sonnet 5.5 <noreply@anthropic.com>
Claude-Session: https://claude.ai/code/session_01MGaeBftyY4mHww6FcGxse3
</commit_message>
<xml_diff>
--- a/Raise_Case_Bailey_Harris.docx
+++ b/Raise_Case_Bailey_Harris.docx
@@ -1888,6 +1888,351 @@
           <w:rFonts w:ascii="Calibri" w:hAnsi="Calibri"/>
           <w:color w:val="1B3F66"/>
         </w:rPr>
+        <w:t>5b. Why $75,000 is not a "25% raise"</w:t>
+      </w:r>
+    </w:p>
+    <w:p>
+      <w:pPr>
+        <w:spacing w:after="80"/>
+      </w:pPr>
+      <w:r>
+        <w:rPr>
+          <w:b w:val="0"/>
+          <w:i w:val="0"/>
+        </w:rPr>
+        <w:t>A routine annual raise is about 3–4%, and Mercer reports planned 2027 merit budgets averaging 3.2% and average planned promotion increases of 8.7% for 2026 (Mercer, mercer.com; figures as cited to me, not independently verified). I am not asking for one annual raise. I have had no adjustment in three years, my scope has grown, and my base is below market. Built up step by step:</w:t>
+      </w:r>
+    </w:p>
+    <w:tbl>
+      <w:tblPr>
+        <w:tblStyle w:val="TableGrid"/>
+        <w:tblW w:type="auto" w:w="0"/>
+        <w:tblLook w:firstColumn="1" w:firstRow="1" w:lastColumn="0" w:lastRow="0" w:noHBand="0" w:noVBand="1" w:val="04A0"/>
+      </w:tblPr>
+      <w:tblGrid>
+        <w:gridCol w:w="3216"/>
+        <w:gridCol w:w="3216"/>
+        <w:gridCol w:w="3216"/>
+      </w:tblGrid>
+      <w:tr>
+        <w:tc>
+          <w:tcPr>
+            <w:tcW w:type="dxa" w:w="3216"/>
+            <w:shd w:val="clear" w:fill="1B3F66"/>
+          </w:tcPr>
+          <w:p>
+            <w:r/>
+            <w:r>
+              <w:rPr>
+                <w:b/>
+                <w:color w:val="FFFFFF"/>
+                <w:sz w:val="19"/>
+              </w:rPr>
+              <w:t>Step</w:t>
+            </w:r>
+          </w:p>
+        </w:tc>
+        <w:tc>
+          <w:tcPr>
+            <w:tcW w:type="dxa" w:w="3216"/>
+            <w:shd w:val="clear" w:fill="1B3F66"/>
+          </w:tcPr>
+          <w:p>
+            <w:pPr>
+              <w:jc w:val="right"/>
+            </w:pPr>
+            <w:r/>
+            <w:r>
+              <w:rPr>
+                <w:b/>
+                <w:color w:val="FFFFFF"/>
+                <w:sz w:val="19"/>
+              </w:rPr>
+              <w:t>Basis</w:t>
+            </w:r>
+          </w:p>
+        </w:tc>
+        <w:tc>
+          <w:tcPr>
+            <w:tcW w:type="dxa" w:w="3216"/>
+            <w:shd w:val="clear" w:fill="1B3F66"/>
+          </w:tcPr>
+          <w:p>
+            <w:pPr>
+              <w:jc w:val="right"/>
+            </w:pPr>
+            <w:r/>
+            <w:r>
+              <w:rPr>
+                <w:b/>
+                <w:color w:val="FFFFFF"/>
+                <w:sz w:val="19"/>
+              </w:rPr>
+              <w:t>Base after</w:t>
+            </w:r>
+          </w:p>
+        </w:tc>
+      </w:tr>
+      <w:tr>
+        <w:tc>
+          <w:tcPr>
+            <w:tcW w:type="dxa" w:w="3216"/>
+          </w:tcPr>
+          <w:p>
+            <w:r/>
+            <w:r>
+              <w:rPr>
+                <w:sz w:val="19"/>
+              </w:rPr>
+              <w:t>Today</w:t>
+            </w:r>
+          </w:p>
+        </w:tc>
+        <w:tc>
+          <w:tcPr>
+            <w:tcW w:type="dxa" w:w="3216"/>
+          </w:tcPr>
+          <w:p>
+            <w:pPr>
+              <w:jc w:val="right"/>
+            </w:pPr>
+            <w:r/>
+            <w:r>
+              <w:rPr>
+                <w:sz w:val="19"/>
+              </w:rPr>
+              <w:t>No change since Sept 2023</w:t>
+            </w:r>
+          </w:p>
+        </w:tc>
+        <w:tc>
+          <w:tcPr>
+            <w:tcW w:type="dxa" w:w="3216"/>
+          </w:tcPr>
+          <w:p>
+            <w:pPr>
+              <w:jc w:val="right"/>
+            </w:pPr>
+            <w:r/>
+            <w:r>
+              <w:rPr>
+                <w:sz w:val="19"/>
+              </w:rPr>
+              <w:t>$60,000</w:t>
+            </w:r>
+          </w:p>
+        </w:tc>
+      </w:tr>
+      <w:tr>
+        <w:tc>
+          <w:tcPr>
+            <w:tcW w:type="dxa" w:w="3216"/>
+          </w:tcPr>
+          <w:p>
+            <w:r/>
+            <w:r>
+              <w:rPr>
+                <w:sz w:val="19"/>
+              </w:rPr>
+              <w:t>1. Three missed annual adjustments</w:t>
+            </w:r>
+          </w:p>
+        </w:tc>
+        <w:tc>
+          <w:tcPr>
+            <w:tcW w:type="dxa" w:w="3216"/>
+          </w:tcPr>
+          <w:p>
+            <w:pPr>
+              <w:jc w:val="right"/>
+            </w:pPr>
+            <w:r/>
+            <w:r>
+              <w:rPr>
+                <w:sz w:val="19"/>
+              </w:rPr>
+              <w:t>3 years at ~3.2% merit (compounded, +9.9%)</w:t>
+            </w:r>
+          </w:p>
+        </w:tc>
+        <w:tc>
+          <w:tcPr>
+            <w:tcW w:type="dxa" w:w="3216"/>
+          </w:tcPr>
+          <w:p>
+            <w:pPr>
+              <w:jc w:val="right"/>
+            </w:pPr>
+            <w:r/>
+            <w:r>
+              <w:rPr>
+                <w:sz w:val="19"/>
+              </w:rPr>
+              <w:t>$65,900</w:t>
+            </w:r>
+          </w:p>
+        </w:tc>
+      </w:tr>
+      <w:tr>
+        <w:tc>
+          <w:tcPr>
+            <w:tcW w:type="dxa" w:w="3216"/>
+          </w:tcPr>
+          <w:p>
+            <w:r/>
+            <w:r>
+              <w:rPr>
+                <w:sz w:val="19"/>
+              </w:rPr>
+              <w:t>2. Scope expansion (demo, onboarding, billing, support, marketing, pricing)</w:t>
+            </w:r>
+          </w:p>
+        </w:tc>
+        <w:tc>
+          <w:tcPr>
+            <w:tcW w:type="dxa" w:w="3216"/>
+          </w:tcPr>
+          <w:p>
+            <w:pPr>
+              <w:jc w:val="right"/>
+            </w:pPr>
+            <w:r/>
+            <w:r>
+              <w:rPr>
+                <w:sz w:val="19"/>
+              </w:rPr>
+              <w:t>Promotion-level adjustment, +8.7%</w:t>
+            </w:r>
+          </w:p>
+        </w:tc>
+        <w:tc>
+          <w:tcPr>
+            <w:tcW w:type="dxa" w:w="3216"/>
+          </w:tcPr>
+          <w:p>
+            <w:pPr>
+              <w:jc w:val="right"/>
+            </w:pPr>
+            <w:r/>
+            <w:r>
+              <w:rPr>
+                <w:sz w:val="19"/>
+              </w:rPr>
+              <w:t>$71,700</w:t>
+            </w:r>
+          </w:p>
+        </w:tc>
+      </w:tr>
+      <w:tr>
+        <w:tc>
+          <w:tcPr>
+            <w:tcW w:type="dxa" w:w="3216"/>
+          </w:tcPr>
+          <w:p>
+            <w:r/>
+            <w:r>
+              <w:rPr>
+                <w:sz w:val="19"/>
+              </w:rPr>
+              <w:t>3. Remaining gap to market</w:t>
+            </w:r>
+          </w:p>
+        </w:tc>
+        <w:tc>
+          <w:tcPr>
+            <w:tcW w:type="dxa" w:w="3216"/>
+          </w:tcPr>
+          <w:p>
+            <w:pPr>
+              <w:jc w:val="right"/>
+            </w:pPr>
+            <w:r/>
+            <w:r>
+              <w:rPr>
+                <w:sz w:val="19"/>
+              </w:rPr>
+              <w:t>Austin SaaS AE median base ~$84K (PayScale); +4.6% to reach $75K</w:t>
+            </w:r>
+          </w:p>
+        </w:tc>
+        <w:tc>
+          <w:tcPr>
+            <w:tcW w:type="dxa" w:w="3216"/>
+          </w:tcPr>
+          <w:p>
+            <w:pPr>
+              <w:jc w:val="right"/>
+            </w:pPr>
+            <w:r/>
+            <w:r>
+              <w:rPr>
+                <w:sz w:val="19"/>
+              </w:rPr>
+              <w:t>$75,000</w:t>
+            </w:r>
+          </w:p>
+        </w:tc>
+      </w:tr>
+    </w:tbl>
+    <w:p>
+      <w:pPr>
+        <w:spacing w:after="40"/>
+      </w:pPr>
+    </w:p>
+    <w:p>
+      <w:pPr>
+        <w:pStyle w:val="ListBullet"/>
+        <w:spacing w:after="40"/>
+      </w:pPr>
+      <w:r>
+        <w:rPr>
+          <w:b/>
+        </w:rPr>
+        <w:t>Bottom line.</w:t>
+      </w:r>
+      <w:r>
+        <w:t xml:space="preserve"> $75,000 is a catch-up for three skipped merit cycles, plus a promotion-sized step for a role that is much larger than the one I was hired into, plus a modest further step. It is still about 11% below the PayScale Austin median of ~$84K.</w:t>
+      </w:r>
+    </w:p>
+    <w:p>
+      <w:pPr>
+        <w:pStyle w:val="ListBullet"/>
+        <w:spacing w:after="40"/>
+      </w:pPr>
+      <w:r>
+        <w:rPr>
+          <w:b/>
+        </w:rPr>
+        <w:t>Commission is not base.</w:t>
+      </w:r>
+      <w:r>
+        <w:t xml:space="preserve"> Base, target commission and quota are separate. A higher earning opportunity from more sales is not guaranteed pay. My base is the only part of my compensation that does not depend on hitting numbers, and it has not moved in three years.</w:t>
+      </w:r>
+    </w:p>
+    <w:p>
+      <w:pPr>
+        <w:pStyle w:val="ListBullet"/>
+        <w:spacing w:after="40"/>
+      </w:pPr>
+      <w:r>
+        <w:rPr>
+          <w:b/>
+        </w:rPr>
+        <w:t>No promotion route.</w:t>
+      </w:r>
+      <w:r>
+        <w:t xml:space="preserve"> There is no promotion path at the company, so this raise has to cover both the missed annual adjustments and the scope change that a promotion would normally have recognized.</w:t>
+      </w:r>
+    </w:p>
+    <w:p>
+      <w:pPr>
+        <w:pStyle w:val="Heading1"/>
+      </w:pPr>
+      <w:r>
+        <w:rPr>
+          <w:rFonts w:ascii="Calibri" w:hAnsi="Calibri"/>
+          <w:color w:val="1B3F66"/>
+        </w:rPr>
         <w:t>6. Market and cost context</w:t>
       </w:r>
     </w:p>
@@ -2173,6 +2518,36 @@
                 <w:sz w:val="19"/>
               </w:rPr>
               <w:t>Team order count fell after June (636 vs. 797 in the same months last year), but revenue rose, and my own order count grew (310 to 327). Part of the team decline is the smaller team (one seller left in Jan 2026). Know your answer before walking in.</w:t>
+            </w:r>
+          </w:p>
+        </w:tc>
+      </w:tr>
+      <w:tr>
+        <w:tc>
+          <w:tcPr>
+            <w:tcW w:type="dxa" w:w="4824"/>
+          </w:tcPr>
+          <w:p>
+            <w:r/>
+            <w:r>
+              <w:rPr>
+                <w:sz w:val="19"/>
+              </w:rPr>
+              <w:t>"25% is far above a normal raise."</w:t>
+            </w:r>
+          </w:p>
+        </w:tc>
+        <w:tc>
+          <w:tcPr>
+            <w:tcW w:type="dxa" w:w="4824"/>
+          </w:tcPr>
+          <w:p>
+            <w:r/>
+            <w:r>
+              <w:rPr>
+                <w:sz w:val="19"/>
+              </w:rPr>
+              <w:t>It is not an annual raise. It is three skipped merit cycles (~$65.9K), a promotion-sized step for the expanded role (~$71.7K), and a modest step to $75K, still below the ~$84K market median. See section 5b.</w:t>
             </w:r>
           </w:p>
         </w:tc>

</xml_diff>

<commit_message>
Reframe raise breakdown using strong-performer merit benchmark
Co-Authored-By: Claude Sonnet 5.5 <noreply@anthropic.com>
Claude-Session: https://claude.ai/code/session_01MGaeBftyY4mHww6FcGxse3
</commit_message>
<xml_diff>
--- a/Raise_Case_Bailey_Harris.docx
+++ b/Raise_Case_Bailey_Harris.docx
@@ -1948,7 +1948,7 @@
                 <w:color w:val="FFFFFF"/>
                 <w:sz w:val="19"/>
               </w:rPr>
-              <w:t>Basis</w:t>
+              <w:t>Average merit (~3.2%/yr)</w:t>
             </w:r>
           </w:p>
         </w:tc>
@@ -1968,7 +1968,7 @@
                 <w:color w:val="FFFFFF"/>
                 <w:sz w:val="19"/>
               </w:rPr>
-              <w:t>Base after</w:t>
+              <w:t>Strong performer (~6%/yr)</w:t>
             </w:r>
           </w:p>
         </w:tc>
@@ -1984,7 +1984,7 @@
               <w:rPr>
                 <w:sz w:val="19"/>
               </w:rPr>
-              <w:t>Today</w:t>
+              <w:t>Today (no change since Sept 2023)</w:t>
             </w:r>
           </w:p>
         </w:tc>
@@ -2001,7 +2001,7 @@
               <w:rPr>
                 <w:sz w:val="19"/>
               </w:rPr>
-              <w:t>No change since Sept 2023</w:t>
+              <w:t>$60,000</w:t>
             </w:r>
           </w:p>
         </w:tc>
@@ -2034,24 +2034,7 @@
               <w:rPr>
                 <w:sz w:val="19"/>
               </w:rPr>
-              <w:t>1. Three missed annual adjustments</w:t>
-            </w:r>
-          </w:p>
-        </w:tc>
-        <w:tc>
-          <w:tcPr>
-            <w:tcW w:type="dxa" w:w="3216"/>
-          </w:tcPr>
-          <w:p>
-            <w:pPr>
-              <w:jc w:val="right"/>
-            </w:pPr>
-            <w:r/>
-            <w:r>
-              <w:rPr>
-                <w:sz w:val="19"/>
-              </w:rPr>
-              <w:t>3 years at ~3.2% merit (compounded, +9.9%)</w:t>
+              <w:t>After three missed annual raises, compounded</w:t>
             </w:r>
           </w:p>
         </w:tc>
@@ -2072,6 +2055,23 @@
             </w:r>
           </w:p>
         </w:tc>
+        <w:tc>
+          <w:tcPr>
+            <w:tcW w:type="dxa" w:w="3216"/>
+          </w:tcPr>
+          <w:p>
+            <w:pPr>
+              <w:jc w:val="right"/>
+            </w:pPr>
+            <w:r/>
+            <w:r>
+              <w:rPr>
+                <w:sz w:val="19"/>
+              </w:rPr>
+              <w:t>$71,500 (range $69,500 to $73,500 at 5% to 7%)</w:t>
+            </w:r>
+          </w:p>
+        </w:tc>
       </w:tr>
       <w:tr>
         <w:tc>
@@ -2084,7 +2084,7 @@
               <w:rPr>
                 <w:sz w:val="19"/>
               </w:rPr>
-              <w:t>2. Scope expansion (demo, onboarding, billing, support, marketing, pricing)</w:t>
+              <w:t>Step still needed to reach $75,000 (scope of role / below-market base)</w:t>
             </w:r>
           </w:p>
         </w:tc>
@@ -2101,7 +2101,7 @@
               <w:rPr>
                 <w:sz w:val="19"/>
               </w:rPr>
-              <w:t>Promotion-level adjustment, +8.7%</w:t>
+              <w:t>+13.7% (about a promotion-sized 8.7% plus 4.6%)</w:t>
             </w:r>
           </w:p>
         </w:tc>
@@ -2118,57 +2118,7 @@
               <w:rPr>
                 <w:sz w:val="19"/>
               </w:rPr>
-              <w:t>$71,700</w:t>
-            </w:r>
-          </w:p>
-        </w:tc>
-      </w:tr>
-      <w:tr>
-        <w:tc>
-          <w:tcPr>
-            <w:tcW w:type="dxa" w:w="3216"/>
-          </w:tcPr>
-          <w:p>
-            <w:r/>
-            <w:r>
-              <w:rPr>
-                <w:sz w:val="19"/>
-              </w:rPr>
-              <w:t>3. Remaining gap to market</w:t>
-            </w:r>
-          </w:p>
-        </w:tc>
-        <w:tc>
-          <w:tcPr>
-            <w:tcW w:type="dxa" w:w="3216"/>
-          </w:tcPr>
-          <w:p>
-            <w:pPr>
-              <w:jc w:val="right"/>
-            </w:pPr>
-            <w:r/>
-            <w:r>
-              <w:rPr>
-                <w:sz w:val="19"/>
-              </w:rPr>
-              <w:t>Austin SaaS AE median base ~$84K (PayScale); +4.6% to reach $75K</w:t>
-            </w:r>
-          </w:p>
-        </w:tc>
-        <w:tc>
-          <w:tcPr>
-            <w:tcW w:type="dxa" w:w="3216"/>
-          </w:tcPr>
-          <w:p>
-            <w:pPr>
-              <w:jc w:val="right"/>
-            </w:pPr>
-            <w:r/>
-            <w:r>
-              <w:rPr>
-                <w:sz w:val="19"/>
-              </w:rPr>
-              <w:t>$75,000</w:t>
+              <w:t>+4.9%</w:t>
             </w:r>
           </w:p>
         </w:tc>
@@ -2178,6 +2128,18 @@
       <w:pPr>
         <w:spacing w:after="40"/>
       </w:pPr>
+    </w:p>
+    <w:p>
+      <w:pPr>
+        <w:spacing w:after="80"/>
+      </w:pPr>
+      <w:r>
+        <w:rPr>
+          <w:b w:val="0"/>
+          <w:i w:val="0"/>
+        </w:rPr>
+        <w:t>A 5% to 7% raise is the range generally treated as a strong raise for strong performance in the same role (a practical benchmark, not a verified sales average). My results meet that bar: I exceeded all four quarterly targets set for me (111% to 156%) and grew revenue 25% to 28% a year.</w:t>
+      </w:r>
     </w:p>
     <w:p>
       <w:pPr>
@@ -2191,7 +2153,22 @@
         <w:t>Bottom line.</w:t>
       </w:r>
       <w:r>
-        <w:t xml:space="preserve"> $75,000 is a catch-up for three skipped merit cycles, plus a promotion-sized step for a role that is much larger than the one I was hired into, plus a modest further step. It is still about 11% below the PayScale Austin median of ~$84K.</w:t>
+        <w:t xml:space="preserve"> Even on average merit, $75,000 is three skipped raises plus a promotion-sized step for a much larger role. On the strong-performer benchmark, which my results support, it is mostly just the raises I did not get, plus about 5% for the expanded scope. Either way it is still about 11% below the PayScale Austin median of ~$84K.</w:t>
+      </w:r>
+    </w:p>
+    <w:p>
+      <w:pPr>
+        <w:pStyle w:val="ListBullet"/>
+        <w:spacing w:after="40"/>
+      </w:pPr>
+      <w:r>
+        <w:rPr>
+          <w:b/>
+        </w:rPr>
+        <w:t>How to use it.</w:t>
+      </w:r>
+      <w:r>
+        <w:t xml:space="preserve"> Use the strong-performer route as the lead, since it is the easier one to defend. Do not add both the 6% raises and the 8.7% promotion step together to claim $80K: that double counts and weakens the credibility of the rest.</w:t>
       </w:r>
     </w:p>
     <w:p>
@@ -2547,7 +2524,7 @@
               <w:rPr>
                 <w:sz w:val="19"/>
               </w:rPr>
-              <w:t>It is not an annual raise. It is three skipped merit cycles (~$65.9K), a promotion-sized step for the expanded role (~$71.7K), and a modest step to $75K, still below the ~$84K market median. See section 5b.</w:t>
+              <w:t>It is not an annual raise. It is three years of missed raises (~$71.5K at a strong performer's 6% a year, ~$65.9K at average merit) plus a small step of about 5% for the expanded scope, and it is still below the ~$84K market median. See section 5b.</w:t>
             </w:r>
           </w:p>
         </w:tc>

</xml_diff>